<commit_message>
Persist project steps and add secondary frontage setback
Store the current wizard step on each project and resume at that step when reopening it. Add optional secondary street frontage setback inputs and include the value conditionally in Word reports.\n\nCo-authored-by: Copilot <223556219+Copilot@users.noreply.github.com>
</commit_message>
<xml_diff>
--- a/server/template.docx
+++ b/server/template.docx
@@ -12216,6 +12216,40 @@
                 <w:bCs/>
               </w:rPr>
               <w:t>m</w:t>
+            </w:r>
+          </w:p>
+          <w:p>
+            <w:pPr>
+              <w:autoSpaceDE w:val="0"/>
+              <w:autoSpaceDN w:val="0"/>
+              <w:adjustRightInd w:val="0"/>
+              <w:rPr>
+                <w:rFonts w:ascii="Calibri" w:hAnsi="Calibri" w:cs="Calibri"/>
+                <w:b/>
+                <w:bCs/>
+              </w:rPr>
+            </w:pPr>
+            <w:r>
+              <w:rPr>
+                <w:rFonts w:ascii="Calibri" w:hAnsi="Calibri" w:cs="Calibri"/>
+              </w:rPr>
+              <w:t xml:space="preserve">{#hasSecondaryStreetFrontage}Secondary frontage setback achieved: </w:t>
+            </w:r>
+            <w:r>
+              <w:rPr>
+                <w:rFonts w:ascii="Calibri" w:hAnsi="Calibri" w:cs="Calibri"/>
+                <w:b/>
+                <w:bCs/>
+              </w:rPr>
+              <w:t>{secondaryStreetSetbackDistance}</w:t>
+            </w:r>
+            <w:r>
+              <w:rPr>
+                <w:rFonts w:ascii="Calibri" w:hAnsi="Calibri" w:cs="Calibri"/>
+                <w:b/>
+                <w:bCs/>
+              </w:rPr>
+              <w:t>m{/hasSecondaryStreetFrontage}</w:t>
             </w:r>
           </w:p>
           <w:p>

</xml_diff>

<commit_message>
Add canopy trees response field
Co-authored-by: Copilot <223556219+Copilot@users.noreply.github.com>
</commit_message>
<xml_diff>
--- a/server/template.docx
+++ b/server/template.docx
@@ -9356,29 +9356,7 @@
               <w:rPr>
                 <w:rFonts w:ascii="Calibri" w:hAnsi="Calibri" w:cs="Calibri"/>
               </w:rPr>
-              <w:t>Response: As per Arborist Report</w:t>
-            </w:r>
-          </w:p>
-          <w:p>
-            <w:pPr>
-              <w:spacing w:after="0" w:line="259" w:lineRule="auto"/>
-              <w:rPr>
-                <w:rFonts w:ascii="Calibri" w:hAnsi="Calibri" w:cs="Calibri"/>
-              </w:rPr>
-            </w:pPr>
-          </w:p>
-          <w:p>
-            <w:pPr>
-              <w:spacing w:after="0" w:line="259" w:lineRule="auto"/>
-              <w:rPr>
-                <w:rFonts w:ascii="Calibri" w:hAnsi="Calibri" w:cs="Calibri"/>
-              </w:rPr>
-            </w:pPr>
-            <w:r>
-              <w:rPr>
-                <w:rFonts w:ascii="Calibri" w:hAnsi="Calibri" w:cs="Calibri"/>
-              </w:rPr>
-              <w:t>All new canopy trees species and calculations as per provided landscape plan.</w:t>
+              <w:t xml:space="preserve">Response: {canopyTreesResponse}</w:t>
             </w:r>
           </w:p>
         </w:tc>

</xml_diff>